<commit_message>
Phase 2 defect fixes: Pharm I Exams 1-2
Citations removed, stale sets reconciled, truncated master key restored, E2 guide/cram 'only Lecture 4 delivered' wording fixed.
Each class chain was reviewed adversarially and repaired; site-wide 0 citations, 0 lecturer names, 0 answer-key mismatches, 0 console errors (287 pages).

Co-Authored-By: Claude Opus 5.5 (1M context) <noreply@anthropic.com>
</commit_message>
<xml_diff>
--- a/Pharmacology I Exam 2/pharm-exam-2-cram-sheet.docx
+++ b/Pharmacology I Exam 2/pharm-exam-2-cram-sheet.docx
@@ -367,7 +367,7 @@
                 <w:i w:val="0"/>
                 <w:sz w:val="18"/>
               </w:rPr>
-              <w:t>The indications table</w:t>
+              <w:t>That ONE indications table</w:t>
             </w:r>
           </w:p>
         </w:tc>
@@ -390,7 +390,15 @@
                 <w:i w:val="0"/>
                 <w:sz w:val="18"/>
               </w:rPr>
-              <w:t>“Don’t worry so much about indications for use… a lot of them have a lot of crossover.” Slide 14 lists ten antibiotics against overlapping indications; it is orientation, not content.</w:t>
+              <w:t xml:space="preserve">“Don’t worry so much about indications for use… a lot of them have a lot of crossover.” He means the slide listing ten antibiotics against overlapping indications — orientation, not content. </w:t>
+            </w:r>
+            <w:r>
+              <w:rPr>
+                <w:b/>
+                <w:i w:val="0"/>
+                <w:sz w:val="18"/>
+              </w:rPr>
+              <w:t>What each agent is FOR is still asked.</w:t>
             </w:r>
           </w:p>
         </w:tc>
@@ -456,7 +464,23 @@
                 <w:i w:val="0"/>
                 <w:sz w:val="18"/>
               </w:rPr>
-              <w:t>” Only two adverse effects name a drug — see the antibiotics block.</w:t>
+              <w:t xml:space="preserve">” That is about the GENERIC irritation. </w:t>
+            </w:r>
+            <w:r>
+              <w:rPr>
+                <w:b/>
+                <w:i w:val="0"/>
+                <w:sz w:val="18"/>
+              </w:rPr>
+              <w:t>The effects that name one drug are fair game</w:t>
+            </w:r>
+            <w:r>
+              <w:rPr>
+                <w:b w:val="0"/>
+                <w:i w:val="0"/>
+                <w:sz w:val="18"/>
+              </w:rPr>
+              <w:t xml:space="preserve"> — ciprofloxacin’s white precipitate, the bitter taste of the carbonic anhydrase inhibitors, iris colour change with the prostaglandins.</w:t>
             </w:r>
           </w:p>
         </w:tc>

</xml_diff>